<commit_message>
Corregir anécdota del 0xFF: fue prevención por cálculo, no hallazgo de campo
La guía y las notas de la presentación decían "lo descubrimos porque sonaba
un clic fortísimo en las pruebas" — eso no ocurrió. Revisando el historial
de Git se confirma que 0xFF se usó como silencio μ-law desde la primera
versión del companding; el error de rellenar con 0x00 (que decodifica a
-32124, casi fondo de escala) se detectó por aritmética al escribir el
código, nunca llegó a fallar audible en un teléfono real.

Corregido en ambos documentos para que la historia sea la que realmente
pasó: detección matemática preventiva, no depuración de campo. El resto de
anécdotas del proyecto (el crash de audio vía logcat, los 11 s de latencia,
"se recuperó al silenciar el micrófono", los filtros amputando la voz, el
desfase de relojes) se verificaron contra la conversación y sí ocurrieron
tal como están descritas.

Co-Authored-By: Claude Fable 5 <noreply@anthropic.com>
</commit_message>
<xml_diff>
--- a/docs/Guia_Sustentacion_DSP_BT_Analyzer.docx
+++ b/docs/Guia_Sustentacion_DSP_BT_Analyzer.docx
@@ -2951,7 +2951,7 @@
           <w:i/>
           <w:color w:val="595959"/>
         </w:rPr>
-        <w:t xml:space="preserve">Anécdota técnica que demuestra dominio: el “silencio digital” en μ-law NO es el byte 0x00 — es </w:t>
+        <w:t xml:space="preserve">Detalle técnico que demuestra dominio del formato: el “silencio digital” en μ-law NO es el byte 0x00 — es </w:t>
       </w:r>
       <w:r>
         <w:rPr>
@@ -2967,7 +2967,7 @@
           <w:i/>
           <w:color w:val="595959"/>
         </w:rPr>
-        <w:t>. El byte 0x00 decodifica a casi el máximo negativo (-32 124): un estallido. Lo descubrimos porque el relleno del último paquete se hacía con ceros binarios y sonaba un clic fortísimo. El relleno correcto es 0xFF. Si el profesor quiere verificar que el código es de ustedes, esta historia lo demuestra.</w:t>
+        <w:t>. El byte 0x00 decodifica a casi el máximo negativo (-32 124): un estallido, no silencio. No fue un fallo que oyéramos en una prueba: se detectó revisando la aritmética de la codificación al escribir el relleno de paquetes, antes de que llegara a sonar mal en un teléfono. El relleno correcto usa 0xFF. Si el profesor pregunta cómo lo notaron, la respuesta honesta es esa: por cálculo, no por ensayo y error.</w:t>
       </w:r>
     </w:p>
     <w:p>

</xml_diff>